<commit_message>
docs(SRS): versión 1.0 aprobada (tarea 2.3)
El equipo aprobó el SRS el 23-10-2026 (hito D1, puerta de fase 2). Los
requisitos no cambian respecto de la 0.4. Esta versión:

- Fecha la versión 1.0 en el control del documento y completa la tabla de
  aprobación. La aprobación la registra el jefe de proyecto.
- Marca el criterio de revisión de los cuatro integrantes (§9).
- Agrega a la nota del RNF-05 el recall de train-10: 0,947 en casco y 0,887
  en chaleco.

Co-Authored-By: Claude Opus 5.5 <noreply@anthropic.com>
</commit_message>
<xml_diff>
--- a/Fase 2/Evidencias Grupales/D1_SRS_CascoVision.docx
+++ b/Fase 2/Evidencias Grupales/D1_SRS_CascoVision.docx
@@ -31,7 +31,7 @@
         <w:pStyle w:val="Fecha"/>
       </w:pPr>
       <w:r>
-        <w:t>Capstone PTY4614 · 2026.02 · Versión 0.4 (candidata a 1.0) · 20-10-2026</w:t>
+        <w:t>Capstone PTY4614 · 2026.02 · Versión 1.0 (aprobada) · 23-10-2026</w:t>
       </w:r>
     </w:p>
     <w:sdt>
@@ -42,7 +42,7 @@
           <w:sz w:val="24"/>
           <w:szCs w:val="24"/>
         </w:rPr>
-        <w:id w:val="-893738621"/>
+        <w:id w:val="52516651"/>
         <w:docPartObj>
           <w:docPartGallery w:val="Table of Contents"/>
           <w:docPartUnique/>
@@ -81,7 +81,7 @@
           <w:r>
             <w:fldChar w:fldCharType="separate"/>
           </w:r>
-          <w:hyperlink w:anchor="_Toc243424381" w:history="1">
+          <w:hyperlink w:anchor="_Toc243611113" w:history="1">
             <w:r>
               <w:rPr>
                 <w:rStyle w:val="Hipervnculo"/>
@@ -108,7 +108,7 @@
                 <w:noProof/>
                 <w:webHidden/>
               </w:rPr>
-              <w:instrText xml:space="preserve"> PAGEREF _Toc243424381 \h </w:instrText>
+              <w:instrText xml:space="preserve"> PAGEREF _Toc243611113 \h </w:instrText>
             </w:r>
             <w:r>
               <w:rPr>
@@ -153,7 +153,7 @@
               <w14:ligatures w14:val="standardContextual"/>
             </w:rPr>
           </w:pPr>
-          <w:hyperlink w:anchor="_Toc243424382" w:history="1">
+          <w:hyperlink w:anchor="_Toc243611114" w:history="1">
             <w:r>
               <w:rPr>
                 <w:rStyle w:val="Hipervnculo"/>
@@ -180,7 +180,7 @@
                 <w:noProof/>
                 <w:webHidden/>
               </w:rPr>
-              <w:instrText xml:space="preserve"> PAGEREF _Toc243424382 \h </w:instrText>
+              <w:instrText xml:space="preserve"> PAGEREF _Toc243611114 \h </w:instrText>
             </w:r>
             <w:r>
               <w:rPr>
@@ -225,7 +225,7 @@
               <w14:ligatures w14:val="standardContextual"/>
             </w:rPr>
           </w:pPr>
-          <w:hyperlink w:anchor="_Toc243424383" w:history="1">
+          <w:hyperlink w:anchor="_Toc243611115" w:history="1">
             <w:r>
               <w:rPr>
                 <w:rStyle w:val="Hipervnculo"/>
@@ -252,7 +252,7 @@
                 <w:noProof/>
                 <w:webHidden/>
               </w:rPr>
-              <w:instrText xml:space="preserve"> PAGEREF _Toc243424383 \h </w:instrText>
+              <w:instrText xml:space="preserve"> PAGEREF _Toc243611115 \h </w:instrText>
             </w:r>
             <w:r>
               <w:rPr>
@@ -297,7 +297,7 @@
               <w14:ligatures w14:val="standardContextual"/>
             </w:rPr>
           </w:pPr>
-          <w:hyperlink w:anchor="_Toc243424384" w:history="1">
+          <w:hyperlink w:anchor="_Toc243611116" w:history="1">
             <w:r>
               <w:rPr>
                 <w:rStyle w:val="Hipervnculo"/>
@@ -324,7 +324,7 @@
                 <w:noProof/>
                 <w:webHidden/>
               </w:rPr>
-              <w:instrText xml:space="preserve"> PAGEREF _Toc243424384 \h </w:instrText>
+              <w:instrText xml:space="preserve"> PAGEREF _Toc243611116 \h </w:instrText>
             </w:r>
             <w:r>
               <w:rPr>
@@ -369,7 +369,7 @@
               <w14:ligatures w14:val="standardContextual"/>
             </w:rPr>
           </w:pPr>
-          <w:hyperlink w:anchor="_Toc243424385" w:history="1">
+          <w:hyperlink w:anchor="_Toc243611117" w:history="1">
             <w:r>
               <w:rPr>
                 <w:rStyle w:val="Hipervnculo"/>
@@ -396,7 +396,7 @@
                 <w:noProof/>
                 <w:webHidden/>
               </w:rPr>
-              <w:instrText xml:space="preserve"> PAGEREF _Toc243424385 \h </w:instrText>
+              <w:instrText xml:space="preserve"> PAGEREF _Toc243611117 \h </w:instrText>
             </w:r>
             <w:r>
               <w:rPr>
@@ -441,7 +441,7 @@
               <w14:ligatures w14:val="standardContextual"/>
             </w:rPr>
           </w:pPr>
-          <w:hyperlink w:anchor="_Toc243424386" w:history="1">
+          <w:hyperlink w:anchor="_Toc243611118" w:history="1">
             <w:r>
               <w:rPr>
                 <w:rStyle w:val="Hipervnculo"/>
@@ -468,7 +468,7 @@
                 <w:noProof/>
                 <w:webHidden/>
               </w:rPr>
-              <w:instrText xml:space="preserve"> PAGEREF _Toc243424386 \h </w:instrText>
+              <w:instrText xml:space="preserve"> PAGEREF _Toc243611118 \h </w:instrText>
             </w:r>
             <w:r>
               <w:rPr>
@@ -513,7 +513,7 @@
               <w14:ligatures w14:val="standardContextual"/>
             </w:rPr>
           </w:pPr>
-          <w:hyperlink w:anchor="_Toc243424387" w:history="1">
+          <w:hyperlink w:anchor="_Toc243611119" w:history="1">
             <w:r>
               <w:rPr>
                 <w:rStyle w:val="Hipervnculo"/>
@@ -540,7 +540,7 @@
                 <w:noProof/>
                 <w:webHidden/>
               </w:rPr>
-              <w:instrText xml:space="preserve"> PAGEREF _Toc243424387 \h </w:instrText>
+              <w:instrText xml:space="preserve"> PAGEREF _Toc243611119 \h </w:instrText>
             </w:r>
             <w:r>
               <w:rPr>
@@ -585,7 +585,7 @@
               <w14:ligatures w14:val="standardContextual"/>
             </w:rPr>
           </w:pPr>
-          <w:hyperlink w:anchor="_Toc243424388" w:history="1">
+          <w:hyperlink w:anchor="_Toc243611120" w:history="1">
             <w:r>
               <w:rPr>
                 <w:rStyle w:val="Hipervnculo"/>
@@ -612,7 +612,7 @@
                 <w:noProof/>
                 <w:webHidden/>
               </w:rPr>
-              <w:instrText xml:space="preserve"> PAGEREF _Toc243424388 \h </w:instrText>
+              <w:instrText xml:space="preserve"> PAGEREF _Toc243611120 \h </w:instrText>
             </w:r>
             <w:r>
               <w:rPr>
@@ -657,7 +657,7 @@
               <w14:ligatures w14:val="standardContextual"/>
             </w:rPr>
           </w:pPr>
-          <w:hyperlink w:anchor="_Toc243424389" w:history="1">
+          <w:hyperlink w:anchor="_Toc243611121" w:history="1">
             <w:r>
               <w:rPr>
                 <w:rStyle w:val="Hipervnculo"/>
@@ -684,7 +684,7 @@
                 <w:noProof/>
                 <w:webHidden/>
               </w:rPr>
-              <w:instrText xml:space="preserve"> PAGEREF _Toc243424389 \h </w:instrText>
+              <w:instrText xml:space="preserve"> PAGEREF _Toc243611121 \h </w:instrText>
             </w:r>
             <w:r>
               <w:rPr>
@@ -729,7 +729,7 @@
               <w14:ligatures w14:val="standardContextual"/>
             </w:rPr>
           </w:pPr>
-          <w:hyperlink w:anchor="_Toc243424390" w:history="1">
+          <w:hyperlink w:anchor="_Toc243611122" w:history="1">
             <w:r>
               <w:rPr>
                 <w:rStyle w:val="Hipervnculo"/>
@@ -756,7 +756,7 @@
                 <w:noProof/>
                 <w:webHidden/>
               </w:rPr>
-              <w:instrText xml:space="preserve"> PAGEREF _Toc243424390 \h </w:instrText>
+              <w:instrText xml:space="preserve"> PAGEREF _Toc243611122 \h </w:instrText>
             </w:r>
             <w:r>
               <w:rPr>
@@ -801,7 +801,7 @@
               <w14:ligatures w14:val="standardContextual"/>
             </w:rPr>
           </w:pPr>
-          <w:hyperlink w:anchor="_Toc243424391" w:history="1">
+          <w:hyperlink w:anchor="_Toc243611123" w:history="1">
             <w:r>
               <w:rPr>
                 <w:rStyle w:val="Hipervnculo"/>
@@ -828,7 +828,7 @@
                 <w:noProof/>
                 <w:webHidden/>
               </w:rPr>
-              <w:instrText xml:space="preserve"> PAGEREF _Toc243424391 \h </w:instrText>
+              <w:instrText xml:space="preserve"> PAGEREF _Toc243611123 \h </w:instrText>
             </w:r>
             <w:r>
               <w:rPr>
@@ -873,7 +873,7 @@
               <w14:ligatures w14:val="standardContextual"/>
             </w:rPr>
           </w:pPr>
-          <w:hyperlink w:anchor="_Toc243424392" w:history="1">
+          <w:hyperlink w:anchor="_Toc243611124" w:history="1">
             <w:r>
               <w:rPr>
                 <w:rStyle w:val="Hipervnculo"/>
@@ -900,7 +900,7 @@
                 <w:noProof/>
                 <w:webHidden/>
               </w:rPr>
-              <w:instrText xml:space="preserve"> PAGEREF _Toc243424392 \h </w:instrText>
+              <w:instrText xml:space="preserve"> PAGEREF _Toc243611124 \h </w:instrText>
             </w:r>
             <w:r>
               <w:rPr>
@@ -945,7 +945,7 @@
               <w14:ligatures w14:val="standardContextual"/>
             </w:rPr>
           </w:pPr>
-          <w:hyperlink w:anchor="_Toc243424393" w:history="1">
+          <w:hyperlink w:anchor="_Toc243611125" w:history="1">
             <w:r>
               <w:rPr>
                 <w:rStyle w:val="Hipervnculo"/>
@@ -972,7 +972,7 @@
                 <w:noProof/>
                 <w:webHidden/>
               </w:rPr>
-              <w:instrText xml:space="preserve"> PAGEREF _Toc243424393 \h </w:instrText>
+              <w:instrText xml:space="preserve"> PAGEREF _Toc243611125 \h </w:instrText>
             </w:r>
             <w:r>
               <w:rPr>
@@ -1017,7 +1017,7 @@
               <w14:ligatures w14:val="standardContextual"/>
             </w:rPr>
           </w:pPr>
-          <w:hyperlink w:anchor="_Toc243424394" w:history="1">
+          <w:hyperlink w:anchor="_Toc243611126" w:history="1">
             <w:r>
               <w:rPr>
                 <w:rStyle w:val="Hipervnculo"/>
@@ -1044,7 +1044,7 @@
                 <w:noProof/>
                 <w:webHidden/>
               </w:rPr>
-              <w:instrText xml:space="preserve"> PAGEREF _Toc243424394 \h </w:instrText>
+              <w:instrText xml:space="preserve"> PAGEREF _Toc243611126 \h </w:instrText>
             </w:r>
             <w:r>
               <w:rPr>
@@ -1089,7 +1089,7 @@
               <w14:ligatures w14:val="standardContextual"/>
             </w:rPr>
           </w:pPr>
-          <w:hyperlink w:anchor="_Toc243424395" w:history="1">
+          <w:hyperlink w:anchor="_Toc243611127" w:history="1">
             <w:r>
               <w:rPr>
                 <w:rStyle w:val="Hipervnculo"/>
@@ -1116,7 +1116,7 @@
                 <w:noProof/>
                 <w:webHidden/>
               </w:rPr>
-              <w:instrText xml:space="preserve"> PAGEREF _Toc243424395 \h </w:instrText>
+              <w:instrText xml:space="preserve"> PAGEREF _Toc243611127 \h </w:instrText>
             </w:r>
             <w:r>
               <w:rPr>
@@ -1161,7 +1161,7 @@
               <w14:ligatures w14:val="standardContextual"/>
             </w:rPr>
           </w:pPr>
-          <w:hyperlink w:anchor="_Toc243424396" w:history="1">
+          <w:hyperlink w:anchor="_Toc243611128" w:history="1">
             <w:r>
               <w:rPr>
                 <w:rStyle w:val="Hipervnculo"/>
@@ -1188,7 +1188,7 @@
                 <w:noProof/>
                 <w:webHidden/>
               </w:rPr>
-              <w:instrText xml:space="preserve"> PAGEREF _Toc243424396 \h </w:instrText>
+              <w:instrText xml:space="preserve"> PAGEREF _Toc243611128 \h </w:instrText>
             </w:r>
             <w:r>
               <w:rPr>
@@ -1233,7 +1233,7 @@
               <w14:ligatures w14:val="standardContextual"/>
             </w:rPr>
           </w:pPr>
-          <w:hyperlink w:anchor="_Toc243424397" w:history="1">
+          <w:hyperlink w:anchor="_Toc243611129" w:history="1">
             <w:r>
               <w:rPr>
                 <w:rStyle w:val="Hipervnculo"/>
@@ -1260,7 +1260,7 @@
                 <w:noProof/>
                 <w:webHidden/>
               </w:rPr>
-              <w:instrText xml:space="preserve"> PAGEREF _Toc243424397 \h </w:instrText>
+              <w:instrText xml:space="preserve"> PAGEREF _Toc243611129 \h </w:instrText>
             </w:r>
             <w:r>
               <w:rPr>
@@ -1305,7 +1305,7 @@
               <w14:ligatures w14:val="standardContextual"/>
             </w:rPr>
           </w:pPr>
-          <w:hyperlink w:anchor="_Toc243424398" w:history="1">
+          <w:hyperlink w:anchor="_Toc243611130" w:history="1">
             <w:r>
               <w:rPr>
                 <w:rStyle w:val="Hipervnculo"/>
@@ -1332,7 +1332,7 @@
                 <w:noProof/>
                 <w:webHidden/>
               </w:rPr>
-              <w:instrText xml:space="preserve"> PAGEREF _Toc243424398 \h </w:instrText>
+              <w:instrText xml:space="preserve"> PAGEREF _Toc243611130 \h </w:instrText>
             </w:r>
             <w:r>
               <w:rPr>
@@ -1377,7 +1377,7 @@
               <w14:ligatures w14:val="standardContextual"/>
             </w:rPr>
           </w:pPr>
-          <w:hyperlink w:anchor="_Toc243424399" w:history="1">
+          <w:hyperlink w:anchor="_Toc243611131" w:history="1">
             <w:r>
               <w:rPr>
                 <w:rStyle w:val="Hipervnculo"/>
@@ -1404,7 +1404,7 @@
                 <w:noProof/>
                 <w:webHidden/>
               </w:rPr>
-              <w:instrText xml:space="preserve"> PAGEREF _Toc243424399 \h </w:instrText>
+              <w:instrText xml:space="preserve"> PAGEREF _Toc243611131 \h </w:instrText>
             </w:r>
             <w:r>
               <w:rPr>
@@ -1449,7 +1449,7 @@
               <w14:ligatures w14:val="standardContextual"/>
             </w:rPr>
           </w:pPr>
-          <w:hyperlink w:anchor="_Toc243424400" w:history="1">
+          <w:hyperlink w:anchor="_Toc243611132" w:history="1">
             <w:r>
               <w:rPr>
                 <w:rStyle w:val="Hipervnculo"/>
@@ -1476,7 +1476,7 @@
                 <w:noProof/>
                 <w:webHidden/>
               </w:rPr>
-              <w:instrText xml:space="preserve"> PAGEREF _Toc243424400 \h </w:instrText>
+              <w:instrText xml:space="preserve"> PAGEREF _Toc243611132 \h </w:instrText>
             </w:r>
             <w:r>
               <w:rPr>
@@ -1521,7 +1521,7 @@
               <w14:ligatures w14:val="standardContextual"/>
             </w:rPr>
           </w:pPr>
-          <w:hyperlink w:anchor="_Toc243424401" w:history="1">
+          <w:hyperlink w:anchor="_Toc243611133" w:history="1">
             <w:r>
               <w:rPr>
                 <w:rStyle w:val="Hipervnculo"/>
@@ -1548,7 +1548,7 @@
                 <w:noProof/>
                 <w:webHidden/>
               </w:rPr>
-              <w:instrText xml:space="preserve"> PAGEREF _Toc243424401 \h </w:instrText>
+              <w:instrText xml:space="preserve"> PAGEREF _Toc243611133 \h </w:instrText>
             </w:r>
             <w:r>
               <w:rPr>
@@ -1593,7 +1593,7 @@
               <w14:ligatures w14:val="standardContextual"/>
             </w:rPr>
           </w:pPr>
-          <w:hyperlink w:anchor="_Toc243424402" w:history="1">
+          <w:hyperlink w:anchor="_Toc243611134" w:history="1">
             <w:r>
               <w:rPr>
                 <w:rStyle w:val="Hipervnculo"/>
@@ -1620,7 +1620,7 @@
                 <w:noProof/>
                 <w:webHidden/>
               </w:rPr>
-              <w:instrText xml:space="preserve"> PAGEREF _Toc243424402 \h </w:instrText>
+              <w:instrText xml:space="preserve"> PAGEREF _Toc243611134 \h </w:instrText>
             </w:r>
             <w:r>
               <w:rPr>
@@ -1665,7 +1665,7 @@
               <w14:ligatures w14:val="standardContextual"/>
             </w:rPr>
           </w:pPr>
-          <w:hyperlink w:anchor="_Toc243424403" w:history="1">
+          <w:hyperlink w:anchor="_Toc243611135" w:history="1">
             <w:r>
               <w:rPr>
                 <w:rStyle w:val="Hipervnculo"/>
@@ -1692,7 +1692,7 @@
                 <w:noProof/>
                 <w:webHidden/>
               </w:rPr>
-              <w:instrText xml:space="preserve"> PAGEREF _Toc243424403 \h </w:instrText>
+              <w:instrText xml:space="preserve"> PAGEREF _Toc243611135 \h </w:instrText>
             </w:r>
             <w:r>
               <w:rPr>
@@ -1737,7 +1737,7 @@
               <w14:ligatures w14:val="standardContextual"/>
             </w:rPr>
           </w:pPr>
-          <w:hyperlink w:anchor="_Toc243424404" w:history="1">
+          <w:hyperlink w:anchor="_Toc243611136" w:history="1">
             <w:r>
               <w:rPr>
                 <w:rStyle w:val="Hipervnculo"/>
@@ -1764,7 +1764,7 @@
                 <w:noProof/>
                 <w:webHidden/>
               </w:rPr>
-              <w:instrText xml:space="preserve"> PAGEREF _Toc243424404 \h </w:instrText>
+              <w:instrText xml:space="preserve"> PAGEREF _Toc243611136 \h </w:instrText>
             </w:r>
             <w:r>
               <w:rPr>
@@ -1809,7 +1809,7 @@
               <w14:ligatures w14:val="standardContextual"/>
             </w:rPr>
           </w:pPr>
-          <w:hyperlink w:anchor="_Toc243424405" w:history="1">
+          <w:hyperlink w:anchor="_Toc243611137" w:history="1">
             <w:r>
               <w:rPr>
                 <w:rStyle w:val="Hipervnculo"/>
@@ -1836,7 +1836,7 @@
                 <w:noProof/>
                 <w:webHidden/>
               </w:rPr>
-              <w:instrText xml:space="preserve"> PAGEREF _Toc243424405 \h </w:instrText>
+              <w:instrText xml:space="preserve"> PAGEREF _Toc243611137 \h </w:instrText>
             </w:r>
             <w:r>
               <w:rPr>
@@ -1880,7 +1880,7 @@
         <w:pStyle w:val="Ttulo1"/>
       </w:pPr>
       <w:bookmarkStart w:id="0" w:name="control-del-documento"/>
-      <w:bookmarkStart w:id="1" w:name="_Toc243424381"/>
+      <w:bookmarkStart w:id="1" w:name="_Toc243611113"/>
       <w:r>
         <w:t>Control del documento</w:t>
       </w:r>
@@ -2196,11 +2196,7 @@
               <w:pStyle w:val="Compact"/>
             </w:pPr>
             <w:r>
-              <w:rPr>
-                <w:i/>
-                <w:iCs/>
-              </w:rPr>
-              <w:t>pendiente</w:t>
+              <w:t>23-10-2026</w:t>
             </w:r>
           </w:p>
         </w:tc>
@@ -2226,7 +2222,7 @@
               <w:pStyle w:val="Compact"/>
             </w:pPr>
             <w:r>
-              <w:t>Versión aprobada (puerta de fase 2 · Análisis de requerimientos), en la reunión de la semana 11</w:t>
+              <w:t>Versión aprobada (puerta de fase 2 · Análisis de requerimientos), sin cambios en los requisitos de la 0.4. Aprobación registrada por Iahn Vera (jefe de proyecto) el 23-10-2026.</w:t>
             </w:r>
           </w:p>
         </w:tc>
@@ -2244,7 +2240,10 @@
         <w:t>Metodología:</w:t>
       </w:r>
       <w:r>
-        <w:t xml:space="preserve"> tradicional en cascada. Este documento es el entregable que cierra la </w:t>
+        <w:t xml:space="preserve"> </w:t>
+      </w:r>
+      <w:r>
+        <w:t xml:space="preserve">tradicional en cascada. Este documento es el entregable que cierra la </w:t>
       </w:r>
       <w:r>
         <w:rPr>
@@ -2262,7 +2261,7 @@
         <w:pStyle w:val="Ttulo1"/>
       </w:pPr>
       <w:bookmarkStart w:id="2" w:name="introducción"/>
-      <w:bookmarkStart w:id="3" w:name="_Toc243424382"/>
+      <w:bookmarkStart w:id="3" w:name="_Toc243611114"/>
       <w:bookmarkEnd w:id="0"/>
       <w:r>
         <w:t>1. Introducción</w:t>
@@ -2274,7 +2273,7 @@
         <w:pStyle w:val="Ttulo2"/>
       </w:pPr>
       <w:bookmarkStart w:id="4" w:name="propósito"/>
-      <w:bookmarkStart w:id="5" w:name="_Toc243424383"/>
+      <w:bookmarkStart w:id="5" w:name="_Toc243611115"/>
       <w:r>
         <w:t>1.1 Propósito</w:t>
       </w:r>
@@ -2303,7 +2302,7 @@
         <w:pStyle w:val="Ttulo2"/>
       </w:pPr>
       <w:bookmarkStart w:id="6" w:name="alcance-del-producto"/>
-      <w:bookmarkStart w:id="7" w:name="_Toc243424384"/>
+      <w:bookmarkStart w:id="7" w:name="_Toc243611116"/>
       <w:bookmarkEnd w:id="4"/>
       <w:r>
         <w:t>1.2 Alcance del producto</w:t>
@@ -2343,7 +2342,7 @@
         <w:pStyle w:val="Compact"/>
         <w:numPr>
           <w:ilvl w:val="0"/>
-          <w:numId w:val="20"/>
+          <w:numId w:val="1"/>
         </w:numPr>
       </w:pPr>
       <w:r>
@@ -2351,6 +2350,7 @@
           <w:b/>
           <w:bCs/>
         </w:rPr>
+        <w:lastRenderedPageBreak/>
         <w:t>activa una baliza zonal</w:t>
       </w:r>
       <w:r>
@@ -2362,7 +2362,7 @@
         <w:pStyle w:val="Compact"/>
         <w:numPr>
           <w:ilvl w:val="0"/>
-          <w:numId w:val="20"/>
+          <w:numId w:val="1"/>
         </w:numPr>
       </w:pPr>
       <w:r>
@@ -2374,11 +2374,10 @@
         <w:pStyle w:val="Compact"/>
         <w:numPr>
           <w:ilvl w:val="0"/>
-          <w:numId w:val="20"/>
+          <w:numId w:val="1"/>
         </w:numPr>
       </w:pPr>
       <w:r>
-        <w:lastRenderedPageBreak/>
         <w:t>notifica al prevencionista de riesgos por SMS y correo electrónico;</w:t>
       </w:r>
     </w:p>
@@ -2387,7 +2386,7 @@
         <w:pStyle w:val="Compact"/>
         <w:numPr>
           <w:ilvl w:val="0"/>
-          <w:numId w:val="20"/>
+          <w:numId w:val="1"/>
         </w:numPr>
       </w:pPr>
       <w:r>
@@ -2417,7 +2416,7 @@
         <w:pStyle w:val="Ttulo2"/>
       </w:pPr>
       <w:bookmarkStart w:id="8" w:name="definiciones-y-abreviaturas"/>
-      <w:bookmarkStart w:id="9" w:name="_Toc243424385"/>
+      <w:bookmarkStart w:id="9" w:name="_Toc243611117"/>
       <w:bookmarkEnd w:id="6"/>
       <w:r>
         <w:t>1.3 Definiciones y abreviaturas</w:t>
@@ -2883,7 +2882,7 @@
         <w:pStyle w:val="Ttulo2"/>
       </w:pPr>
       <w:bookmarkStart w:id="10" w:name="referencias"/>
-      <w:bookmarkStart w:id="11" w:name="_Toc243424386"/>
+      <w:bookmarkStart w:id="11" w:name="_Toc243611118"/>
       <w:bookmarkEnd w:id="8"/>
       <w:r>
         <w:t>1.4 Referencias</w:t>
@@ -2895,7 +2894,7 @@
         <w:pStyle w:val="Compact"/>
         <w:numPr>
           <w:ilvl w:val="0"/>
-          <w:numId w:val="21"/>
+          <w:numId w:val="2"/>
         </w:numPr>
       </w:pPr>
       <w:r>
@@ -2913,7 +2912,7 @@
         <w:pStyle w:val="Compact"/>
         <w:numPr>
           <w:ilvl w:val="0"/>
-          <w:numId w:val="21"/>
+          <w:numId w:val="2"/>
         </w:numPr>
       </w:pPr>
       <w:r>
@@ -2932,7 +2931,7 @@
         <w:pStyle w:val="Compact"/>
         <w:numPr>
           <w:ilvl w:val="0"/>
-          <w:numId w:val="21"/>
+          <w:numId w:val="2"/>
         </w:numPr>
       </w:pPr>
       <w:r>
@@ -2944,7 +2943,7 @@
         <w:pStyle w:val="Compact"/>
         <w:numPr>
           <w:ilvl w:val="0"/>
-          <w:numId w:val="21"/>
+          <w:numId w:val="2"/>
         </w:numPr>
       </w:pPr>
       <w:r>
@@ -2992,7 +2991,7 @@
         <w:pStyle w:val="Compact"/>
         <w:numPr>
           <w:ilvl w:val="0"/>
-          <w:numId w:val="21"/>
+          <w:numId w:val="2"/>
         </w:numPr>
       </w:pPr>
       <w:r>
@@ -3004,7 +3003,7 @@
         <w:pStyle w:val="Ttulo1"/>
       </w:pPr>
       <w:bookmarkStart w:id="12" w:name="descripción-del-problema"/>
-      <w:bookmarkStart w:id="13" w:name="_Toc243424387"/>
+      <w:bookmarkStart w:id="13" w:name="_Toc243611119"/>
       <w:bookmarkEnd w:id="2"/>
       <w:bookmarkEnd w:id="10"/>
       <w:r>
@@ -3076,7 +3075,7 @@
         <w:pStyle w:val="Compact"/>
         <w:numPr>
           <w:ilvl w:val="0"/>
-          <w:numId w:val="22"/>
+          <w:numId w:val="3"/>
         </w:numPr>
       </w:pPr>
       <w:r>
@@ -3098,7 +3097,7 @@
         <w:pStyle w:val="Compact"/>
         <w:numPr>
           <w:ilvl w:val="0"/>
-          <w:numId w:val="22"/>
+          <w:numId w:val="3"/>
         </w:numPr>
       </w:pPr>
       <w:r>
@@ -3110,7 +3109,7 @@
         <w:pStyle w:val="Compact"/>
         <w:numPr>
           <w:ilvl w:val="0"/>
-          <w:numId w:val="22"/>
+          <w:numId w:val="3"/>
         </w:numPr>
       </w:pPr>
       <w:r>
@@ -3147,7 +3146,7 @@
         <w:pStyle w:val="Ttulo1"/>
       </w:pPr>
       <w:bookmarkStart w:id="14" w:name="objetivos"/>
-      <w:bookmarkStart w:id="15" w:name="_Toc243424388"/>
+      <w:bookmarkStart w:id="15" w:name="_Toc243611120"/>
       <w:bookmarkEnd w:id="12"/>
       <w:r>
         <w:t>3. Objetivos</w:t>
@@ -3159,7 +3158,7 @@
         <w:pStyle w:val="Ttulo2"/>
       </w:pPr>
       <w:bookmarkStart w:id="16" w:name="objetivo-general"/>
-      <w:bookmarkStart w:id="17" w:name="_Toc243424389"/>
+      <w:bookmarkStart w:id="17" w:name="_Toc243611121"/>
       <w:r>
         <w:t>3.1 Objetivo general</w:t>
       </w:r>
@@ -3178,7 +3177,7 @@
         <w:pStyle w:val="Ttulo2"/>
       </w:pPr>
       <w:bookmarkStart w:id="18" w:name="objetivos-específicos"/>
-      <w:bookmarkStart w:id="19" w:name="_Toc243424390"/>
+      <w:bookmarkStart w:id="19" w:name="_Toc243611122"/>
       <w:bookmarkEnd w:id="16"/>
       <w:r>
         <w:t>3.2 Objetivos específicos</w:t>
@@ -3454,7 +3453,7 @@
         <w:pStyle w:val="Ttulo1"/>
       </w:pPr>
       <w:bookmarkStart w:id="20" w:name="descripción-general-del-sistema"/>
-      <w:bookmarkStart w:id="21" w:name="_Toc243424391"/>
+      <w:bookmarkStart w:id="21" w:name="_Toc243611123"/>
       <w:bookmarkEnd w:id="14"/>
       <w:bookmarkEnd w:id="18"/>
       <w:r>
@@ -3468,7 +3467,7 @@
         <w:pStyle w:val="Ttulo2"/>
       </w:pPr>
       <w:bookmarkStart w:id="22" w:name="perspectiva-del-producto"/>
-      <w:bookmarkStart w:id="23" w:name="_Toc243424392"/>
+      <w:bookmarkStart w:id="23" w:name="_Toc243611124"/>
       <w:r>
         <w:t>4.1 Perspectiva del producto</w:t>
       </w:r>
@@ -3723,7 +3722,7 @@
         <w:pStyle w:val="Ttulo2"/>
       </w:pPr>
       <w:bookmarkStart w:id="24" w:name="actores"/>
-      <w:bookmarkStart w:id="25" w:name="_Toc243424393"/>
+      <w:bookmarkStart w:id="25" w:name="_Toc243611125"/>
       <w:bookmarkEnd w:id="22"/>
       <w:r>
         <w:t>4.2 Actores</w:t>
@@ -4064,7 +4063,7 @@
         <w:pStyle w:val="Ttulo2"/>
       </w:pPr>
       <w:bookmarkStart w:id="26" w:name="supuestos-y-dependencias"/>
-      <w:bookmarkStart w:id="27" w:name="_Toc243424394"/>
+      <w:bookmarkStart w:id="27" w:name="_Toc243611126"/>
       <w:bookmarkEnd w:id="24"/>
       <w:r>
         <w:lastRenderedPageBreak/>
@@ -4077,7 +4076,7 @@
         <w:pStyle w:val="Compact"/>
         <w:numPr>
           <w:ilvl w:val="0"/>
-          <w:numId w:val="23"/>
+          <w:numId w:val="4"/>
         </w:numPr>
       </w:pPr>
       <w:r>
@@ -4089,7 +4088,7 @@
         <w:pStyle w:val="Compact"/>
         <w:numPr>
           <w:ilvl w:val="0"/>
-          <w:numId w:val="23"/>
+          <w:numId w:val="4"/>
         </w:numPr>
       </w:pPr>
       <w:r>
@@ -4101,7 +4100,7 @@
         <w:pStyle w:val="Compact"/>
         <w:numPr>
           <w:ilvl w:val="0"/>
-          <w:numId w:val="23"/>
+          <w:numId w:val="4"/>
         </w:numPr>
       </w:pPr>
       <w:r>
@@ -4113,7 +4112,7 @@
         <w:pStyle w:val="Compact"/>
         <w:numPr>
           <w:ilvl w:val="0"/>
-          <w:numId w:val="23"/>
+          <w:numId w:val="4"/>
         </w:numPr>
       </w:pPr>
       <w:r>
@@ -4125,7 +4124,7 @@
         <w:pStyle w:val="Ttulo2"/>
       </w:pPr>
       <w:bookmarkStart w:id="28" w:name="restricciones"/>
-      <w:bookmarkStart w:id="29" w:name="_Toc243424395"/>
+      <w:bookmarkStart w:id="29" w:name="_Toc243611127"/>
       <w:bookmarkEnd w:id="26"/>
       <w:r>
         <w:t>4.4 Restricciones</w:t>
@@ -4137,7 +4136,7 @@
         <w:pStyle w:val="Compact"/>
         <w:numPr>
           <w:ilvl w:val="0"/>
-          <w:numId w:val="24"/>
+          <w:numId w:val="5"/>
         </w:numPr>
       </w:pPr>
       <w:r>
@@ -4156,7 +4155,7 @@
         <w:pStyle w:val="Compact"/>
         <w:numPr>
           <w:ilvl w:val="0"/>
-          <w:numId w:val="24"/>
+          <w:numId w:val="5"/>
         </w:numPr>
       </w:pPr>
       <w:r>
@@ -4175,7 +4174,7 @@
         <w:pStyle w:val="Compact"/>
         <w:numPr>
           <w:ilvl w:val="0"/>
-          <w:numId w:val="24"/>
+          <w:numId w:val="5"/>
         </w:numPr>
       </w:pPr>
       <w:r>
@@ -4194,7 +4193,7 @@
         <w:pStyle w:val="Compact"/>
         <w:numPr>
           <w:ilvl w:val="0"/>
-          <w:numId w:val="24"/>
+          <w:numId w:val="5"/>
         </w:numPr>
       </w:pPr>
       <w:r>
@@ -4213,7 +4212,7 @@
         <w:pStyle w:val="Compact"/>
         <w:numPr>
           <w:ilvl w:val="0"/>
-          <w:numId w:val="24"/>
+          <w:numId w:val="5"/>
         </w:numPr>
       </w:pPr>
       <w:r>
@@ -4232,7 +4231,7 @@
         <w:pStyle w:val="Ttulo2"/>
       </w:pPr>
       <w:bookmarkStart w:id="30" w:name="fuera-del-alcance"/>
-      <w:bookmarkStart w:id="31" w:name="_Toc243424396"/>
+      <w:bookmarkStart w:id="31" w:name="_Toc243611128"/>
       <w:bookmarkEnd w:id="28"/>
       <w:r>
         <w:t>4.5 Fuera del alcance</w:t>
@@ -4252,7 +4251,7 @@
         <w:pStyle w:val="Ttulo2"/>
       </w:pPr>
       <w:bookmarkStart w:id="32" w:name="decisiones-cerradas-en-la-versión-0.4"/>
-      <w:bookmarkStart w:id="33" w:name="_Toc243424397"/>
+      <w:bookmarkStart w:id="33" w:name="_Toc243611129"/>
       <w:bookmarkEnd w:id="30"/>
       <w:r>
         <w:t>4.6 Decisiones cerradas en la versión 0.4</w:t>
@@ -4720,7 +4719,7 @@
         <w:pStyle w:val="Ttulo1"/>
       </w:pPr>
       <w:bookmarkStart w:id="34" w:name="requisitos-funcionales"/>
-      <w:bookmarkStart w:id="35" w:name="_Toc243424398"/>
+      <w:bookmarkStart w:id="35" w:name="_Toc243611130"/>
       <w:bookmarkEnd w:id="20"/>
       <w:bookmarkEnd w:id="32"/>
       <w:r>
@@ -6160,7 +6159,7 @@
         <w:pStyle w:val="Ttulo1"/>
       </w:pPr>
       <w:bookmarkStart w:id="36" w:name="requisitos-no-funcionales"/>
-      <w:bookmarkStart w:id="37" w:name="_Toc243424399"/>
+      <w:bookmarkStart w:id="37" w:name="_Toc243611131"/>
       <w:bookmarkEnd w:id="34"/>
       <w:r>
         <w:t>6. Requisitos no funcionales</w:t>
@@ -7312,7 +7311,7 @@
         <w:pStyle w:val="Ttulo1"/>
       </w:pPr>
       <w:bookmarkStart w:id="38" w:name="casos-de-uso"/>
-      <w:bookmarkStart w:id="39" w:name="_Toc243424400"/>
+      <w:bookmarkStart w:id="39" w:name="_Toc243611132"/>
       <w:bookmarkEnd w:id="36"/>
       <w:r>
         <w:t>7. Casos de uso</w:t>
@@ -7324,7 +7323,7 @@
         <w:pStyle w:val="Ttulo2"/>
       </w:pPr>
       <w:bookmarkStart w:id="40" w:name="diagrama-de-casos-de-uso"/>
-      <w:bookmarkStart w:id="41" w:name="_Toc243424401"/>
+      <w:bookmarkStart w:id="41" w:name="_Toc243611133"/>
       <w:r>
         <w:t>7.1 Diagrama de casos de uso</w:t>
       </w:r>
@@ -7339,7 +7338,7 @@
           <w:noProof/>
         </w:rPr>
         <w:drawing>
-          <wp:inline distT="0" distB="0" distL="0" distR="0" wp14:anchorId="1337486F" wp14:editId="4AE276AE">
+          <wp:inline distT="0" distB="0" distL="0" distR="0" wp14:anchorId="5054E39B" wp14:editId="63AC8933">
             <wp:extent cx="5600700" cy="4005328"/>
             <wp:effectExtent l="0" t="0" r="0" b="0"/>
             <wp:docPr id="34" name="Picture" descr="Diagrama UML de casos de uso de CascoVision"/>
@@ -7394,7 +7393,7 @@
         <w:pStyle w:val="Ttulo2"/>
       </w:pPr>
       <w:bookmarkStart w:id="42" w:name="resumen-de-casos-de-uso"/>
-      <w:bookmarkStart w:id="43" w:name="_Toc243424402"/>
+      <w:bookmarkStart w:id="43" w:name="_Toc243611134"/>
       <w:bookmarkEnd w:id="40"/>
       <w:r>
         <w:t>7.2 Resumen de casos de uso</w:t>
@@ -8095,7 +8094,7 @@
         <w:pStyle w:val="Ttulo2"/>
       </w:pPr>
       <w:bookmarkStart w:id="44" w:name="Xcc46ed198cbe29b52386f3b28d33d19cbb6f909"/>
-      <w:bookmarkStart w:id="45" w:name="_Toc243424403"/>
+      <w:bookmarkStart w:id="45" w:name="_Toc243611135"/>
       <w:bookmarkEnd w:id="42"/>
       <w:r>
         <w:t>7.3 Especificación de los casos de uso principales</w:t>
@@ -8284,7 +8283,7 @@
         <w:pStyle w:val="Compact"/>
         <w:numPr>
           <w:ilvl w:val="0"/>
-          <w:numId w:val="25"/>
+          <w:numId w:val="6"/>
         </w:numPr>
       </w:pPr>
       <w:r>
@@ -8296,7 +8295,7 @@
         <w:pStyle w:val="Compact"/>
         <w:numPr>
           <w:ilvl w:val="0"/>
-          <w:numId w:val="25"/>
+          <w:numId w:val="6"/>
         </w:numPr>
       </w:pPr>
       <w:r>
@@ -8308,7 +8307,7 @@
         <w:pStyle w:val="Compact"/>
         <w:numPr>
           <w:ilvl w:val="0"/>
-          <w:numId w:val="25"/>
+          <w:numId w:val="6"/>
         </w:numPr>
       </w:pPr>
       <w:r>
@@ -8320,7 +8319,7 @@
         <w:pStyle w:val="Compact"/>
         <w:numPr>
           <w:ilvl w:val="0"/>
-          <w:numId w:val="25"/>
+          <w:numId w:val="6"/>
         </w:numPr>
       </w:pPr>
       <w:r>
@@ -8332,7 +8331,7 @@
         <w:pStyle w:val="Compact"/>
         <w:numPr>
           <w:ilvl w:val="0"/>
-          <w:numId w:val="25"/>
+          <w:numId w:val="6"/>
         </w:numPr>
       </w:pPr>
       <w:r>
@@ -8354,7 +8353,7 @@
         <w:pStyle w:val="Compact"/>
         <w:numPr>
           <w:ilvl w:val="0"/>
-          <w:numId w:val="25"/>
+          <w:numId w:val="6"/>
         </w:numPr>
       </w:pPr>
       <w:r>
@@ -8376,7 +8375,7 @@
         <w:pStyle w:val="Compact"/>
         <w:numPr>
           <w:ilvl w:val="0"/>
-          <w:numId w:val="25"/>
+          <w:numId w:val="6"/>
         </w:numPr>
       </w:pPr>
       <w:r>
@@ -8388,7 +8387,7 @@
         <w:pStyle w:val="Compact"/>
         <w:numPr>
           <w:ilvl w:val="0"/>
-          <w:numId w:val="25"/>
+          <w:numId w:val="6"/>
         </w:numPr>
       </w:pPr>
       <w:r>
@@ -8420,7 +8419,7 @@
         <w:pStyle w:val="Compact"/>
         <w:numPr>
           <w:ilvl w:val="0"/>
-          <w:numId w:val="25"/>
+          <w:numId w:val="6"/>
         </w:numPr>
       </w:pPr>
       <w:r>
@@ -8445,7 +8444,7 @@
         <w:pStyle w:val="Compact"/>
         <w:numPr>
           <w:ilvl w:val="0"/>
-          <w:numId w:val="26"/>
+          <w:numId w:val="7"/>
         </w:numPr>
       </w:pPr>
       <w:r>
@@ -8464,7 +8463,7 @@
         <w:pStyle w:val="Compact"/>
         <w:numPr>
           <w:ilvl w:val="0"/>
-          <w:numId w:val="26"/>
+          <w:numId w:val="7"/>
         </w:numPr>
       </w:pPr>
       <w:r>
@@ -8483,7 +8482,7 @@
         <w:pStyle w:val="Compact"/>
         <w:numPr>
           <w:ilvl w:val="0"/>
-          <w:numId w:val="26"/>
+          <w:numId w:val="7"/>
         </w:numPr>
       </w:pPr>
       <w:r>
@@ -8505,7 +8504,7 @@
         <w:pStyle w:val="Compact"/>
         <w:numPr>
           <w:ilvl w:val="0"/>
-          <w:numId w:val="26"/>
+          <w:numId w:val="7"/>
         </w:numPr>
       </w:pPr>
       <w:r>
@@ -8524,7 +8523,7 @@
         <w:pStyle w:val="Compact"/>
         <w:numPr>
           <w:ilvl w:val="0"/>
-          <w:numId w:val="26"/>
+          <w:numId w:val="7"/>
         </w:numPr>
       </w:pPr>
       <w:r>
@@ -8721,7 +8720,7 @@
         <w:pStyle w:val="Compact"/>
         <w:numPr>
           <w:ilvl w:val="0"/>
-          <w:numId w:val="27"/>
+          <w:numId w:val="8"/>
         </w:numPr>
       </w:pPr>
       <w:r>
@@ -8733,7 +8732,7 @@
         <w:pStyle w:val="Compact"/>
         <w:numPr>
           <w:ilvl w:val="0"/>
-          <w:numId w:val="27"/>
+          <w:numId w:val="8"/>
         </w:numPr>
       </w:pPr>
       <w:r>
@@ -8757,7 +8756,7 @@
         <w:pStyle w:val="Compact"/>
         <w:numPr>
           <w:ilvl w:val="0"/>
-          <w:numId w:val="27"/>
+          <w:numId w:val="8"/>
         </w:numPr>
       </w:pPr>
       <w:r>
@@ -8769,7 +8768,7 @@
         <w:pStyle w:val="Compact"/>
         <w:numPr>
           <w:ilvl w:val="0"/>
-          <w:numId w:val="27"/>
+          <w:numId w:val="8"/>
         </w:numPr>
       </w:pPr>
       <w:r>
@@ -8781,7 +8780,7 @@
         <w:pStyle w:val="Compact"/>
         <w:numPr>
           <w:ilvl w:val="0"/>
-          <w:numId w:val="27"/>
+          <w:numId w:val="8"/>
         </w:numPr>
       </w:pPr>
       <w:r>
@@ -8805,7 +8804,7 @@
         <w:pStyle w:val="Compact"/>
         <w:numPr>
           <w:ilvl w:val="0"/>
-          <w:numId w:val="28"/>
+          <w:numId w:val="9"/>
         </w:numPr>
       </w:pPr>
       <w:r>
@@ -8834,7 +8833,7 @@
         <w:pStyle w:val="Compact"/>
         <w:numPr>
           <w:ilvl w:val="0"/>
-          <w:numId w:val="28"/>
+          <w:numId w:val="9"/>
         </w:numPr>
       </w:pPr>
       <w:r>
@@ -8856,7 +8855,7 @@
         <w:pStyle w:val="Compact"/>
         <w:numPr>
           <w:ilvl w:val="0"/>
-          <w:numId w:val="28"/>
+          <w:numId w:val="9"/>
         </w:numPr>
       </w:pPr>
       <w:r>
@@ -9026,7 +9025,7 @@
         <w:pStyle w:val="Compact"/>
         <w:numPr>
           <w:ilvl w:val="0"/>
-          <w:numId w:val="29"/>
+          <w:numId w:val="10"/>
         </w:numPr>
       </w:pPr>
       <w:r>
@@ -9038,7 +9037,7 @@
         <w:pStyle w:val="Compact"/>
         <w:numPr>
           <w:ilvl w:val="0"/>
-          <w:numId w:val="29"/>
+          <w:numId w:val="10"/>
         </w:numPr>
       </w:pPr>
       <w:r>
@@ -9050,7 +9049,7 @@
         <w:pStyle w:val="Compact"/>
         <w:numPr>
           <w:ilvl w:val="0"/>
-          <w:numId w:val="29"/>
+          <w:numId w:val="10"/>
         </w:numPr>
       </w:pPr>
       <w:r>
@@ -9062,7 +9061,7 @@
         <w:pStyle w:val="Compact"/>
         <w:numPr>
           <w:ilvl w:val="0"/>
-          <w:numId w:val="29"/>
+          <w:numId w:val="10"/>
         </w:numPr>
       </w:pPr>
       <w:r>
@@ -9086,7 +9085,7 @@
         <w:pStyle w:val="Compact"/>
         <w:numPr>
           <w:ilvl w:val="0"/>
-          <w:numId w:val="30"/>
+          <w:numId w:val="11"/>
         </w:numPr>
       </w:pPr>
       <w:r>
@@ -9105,7 +9104,7 @@
         <w:pStyle w:val="Compact"/>
         <w:numPr>
           <w:ilvl w:val="0"/>
-          <w:numId w:val="30"/>
+          <w:numId w:val="11"/>
         </w:numPr>
       </w:pPr>
       <w:r>
@@ -9277,7 +9276,7 @@
         <w:pStyle w:val="Compact"/>
         <w:numPr>
           <w:ilvl w:val="0"/>
-          <w:numId w:val="31"/>
+          <w:numId w:val="12"/>
         </w:numPr>
       </w:pPr>
       <w:r>
@@ -9289,7 +9288,7 @@
         <w:pStyle w:val="Compact"/>
         <w:numPr>
           <w:ilvl w:val="0"/>
-          <w:numId w:val="31"/>
+          <w:numId w:val="12"/>
         </w:numPr>
       </w:pPr>
       <w:r>
@@ -9301,7 +9300,7 @@
         <w:pStyle w:val="Compact"/>
         <w:numPr>
           <w:ilvl w:val="0"/>
-          <w:numId w:val="31"/>
+          <w:numId w:val="12"/>
         </w:numPr>
       </w:pPr>
       <w:r>
@@ -9313,7 +9312,7 @@
         <w:pStyle w:val="Compact"/>
         <w:numPr>
           <w:ilvl w:val="0"/>
-          <w:numId w:val="31"/>
+          <w:numId w:val="12"/>
         </w:numPr>
       </w:pPr>
       <w:r>
@@ -9325,7 +9324,7 @@
         <w:pStyle w:val="Compact"/>
         <w:numPr>
           <w:ilvl w:val="0"/>
-          <w:numId w:val="31"/>
+          <w:numId w:val="12"/>
         </w:numPr>
       </w:pPr>
       <w:r>
@@ -9349,7 +9348,7 @@
         <w:pStyle w:val="Compact"/>
         <w:numPr>
           <w:ilvl w:val="0"/>
-          <w:numId w:val="32"/>
+          <w:numId w:val="13"/>
         </w:numPr>
       </w:pPr>
       <w:r>
@@ -9368,7 +9367,7 @@
         <w:pStyle w:val="Compact"/>
         <w:numPr>
           <w:ilvl w:val="0"/>
-          <w:numId w:val="32"/>
+          <w:numId w:val="13"/>
         </w:numPr>
       </w:pPr>
       <w:r>
@@ -9387,7 +9386,7 @@
         <w:pStyle w:val="Ttulo1"/>
       </w:pPr>
       <w:bookmarkStart w:id="50" w:name="matriz-de-trazabilidad"/>
-      <w:bookmarkStart w:id="51" w:name="_Toc243424404"/>
+      <w:bookmarkStart w:id="51" w:name="_Toc243611136"/>
       <w:bookmarkEnd w:id="38"/>
       <w:bookmarkEnd w:id="44"/>
       <w:bookmarkEnd w:id="49"/>
@@ -9866,7 +9865,7 @@
         <w:pStyle w:val="Ttulo1"/>
       </w:pPr>
       <w:bookmarkStart w:id="52" w:name="criterios-de-aceptación-del-documento"/>
-      <w:bookmarkStart w:id="53" w:name="_Toc243424405"/>
+      <w:bookmarkStart w:id="53" w:name="_Toc243611137"/>
       <w:bookmarkEnd w:id="50"/>
       <w:r>
         <w:t>9. Criterios de aceptación del documento</w:t>
@@ -9886,7 +9885,7 @@
         <w:pStyle w:val="Compact"/>
         <w:numPr>
           <w:ilvl w:val="0"/>
-          <w:numId w:val="33"/>
+          <w:numId w:val="14"/>
         </w:numPr>
       </w:pPr>
       <w:r>
@@ -9898,7 +9897,7 @@
         <w:pStyle w:val="Compact"/>
         <w:numPr>
           <w:ilvl w:val="0"/>
-          <w:numId w:val="34"/>
+          <w:numId w:val="15"/>
         </w:numPr>
       </w:pPr>
       <w:r>
@@ -9910,7 +9909,7 @@
         <w:pStyle w:val="Compact"/>
         <w:numPr>
           <w:ilvl w:val="0"/>
-          <w:numId w:val="35"/>
+          <w:numId w:val="16"/>
         </w:numPr>
       </w:pPr>
       <w:r>
@@ -9922,7 +9921,7 @@
         <w:pStyle w:val="Compact"/>
         <w:numPr>
           <w:ilvl w:val="0"/>
-          <w:numId w:val="36"/>
+          <w:numId w:val="17"/>
         </w:numPr>
       </w:pPr>
       <w:r>
@@ -9938,7 +9937,7 @@
           <w:b/>
           <w:bCs/>
         </w:rPr>
-        <w:t>Puntos a confirmar en la reunión de aprobación:</w:t>
+        <w:t>Puntos aceptados en la aprobación (23-10-2026):</w:t>
       </w:r>
     </w:p>
     <w:p>
@@ -9946,7 +9945,7 @@
         <w:pStyle w:val="Compact"/>
         <w:numPr>
           <w:ilvl w:val="0"/>
-          <w:numId w:val="37"/>
+          <w:numId w:val="18"/>
         </w:numPr>
       </w:pPr>
       <w:r>
@@ -9989,7 +9988,26 @@
         <w:t>recall</w:t>
       </w:r>
       <w:r>
-        <w:t xml:space="preserve"> 0,757). El criterio se mantiene; lo que debe mejorar es el modelo.</w:t>
+        <w:t xml:space="preserve"> 0,757). El criterio se mantiene; lo que debe mejorar es el modelo. Con </w:t>
+      </w:r>
+      <w:r>
+        <w:rPr>
+          <w:rStyle w:val="VerbatimChar"/>
+        </w:rPr>
+        <w:t>train-10</w:t>
+      </w:r>
+      <w:r>
+        <w:t xml:space="preserve"> (detector de 5 clases, 21-10-2026), el </w:t>
+      </w:r>
+      <w:r>
+        <w:rPr>
+          <w:i/>
+          <w:iCs/>
+        </w:rPr>
+        <w:t>recall</w:t>
+      </w:r>
+      <w:r>
+        <w:t xml:space="preserve"> de las reglas sube a 0,947 en casco y 0,887 en chaleco, y ambas cumplen. La validación final con datos separados es la tarea 5.6.</w:t>
       </w:r>
     </w:p>
     <w:p>
@@ -9997,7 +10015,7 @@
         <w:pStyle w:val="Compact"/>
         <w:numPr>
           <w:ilvl w:val="0"/>
-          <w:numId w:val="37"/>
+          <w:numId w:val="18"/>
         </w:numPr>
       </w:pPr>
       <w:r>
@@ -10008,7 +10026,10 @@
         <w:t>RF-19 y RNF-18:</w:t>
       </w:r>
       <w:r>
-        <w:t xml:space="preserve"> requisitos nuevos que formalizan lo que la API ya implementa (token del agente) y lo que falta construir (entrega autenticada de la evidencia).</w:t>
+        <w:t xml:space="preserve"> </w:t>
+      </w:r>
+      <w:r>
+        <w:t>requisitos nuevos que formalizan lo que la API ya implementa (token del agente) y lo que falta construir (entrega autenticada de la evidencia).</w:t>
       </w:r>
     </w:p>
     <w:p>
@@ -10016,7 +10037,7 @@
         <w:pStyle w:val="Compact"/>
         <w:numPr>
           <w:ilvl w:val="0"/>
-          <w:numId w:val="37"/>
+          <w:numId w:val="18"/>
         </w:numPr>
       </w:pPr>
       <w:r>
@@ -10035,7 +10056,7 @@
         <w:pStyle w:val="Compact"/>
         <w:numPr>
           <w:ilvl w:val="0"/>
-          <w:numId w:val="37"/>
+          <w:numId w:val="18"/>
         </w:numPr>
       </w:pPr>
       <w:r>
@@ -10057,10 +10078,10 @@
         <w:tblLook w:val="0020" w:firstRow="1" w:lastRow="0" w:firstColumn="0" w:lastColumn="0" w:noHBand="0" w:noVBand="0"/>
       </w:tblPr>
       <w:tblGrid>
-        <w:gridCol w:w="2241"/>
-        <w:gridCol w:w="4303"/>
-        <w:gridCol w:w="1524"/>
-        <w:gridCol w:w="986"/>
+        <w:gridCol w:w="2264"/>
+        <w:gridCol w:w="3712"/>
+        <w:gridCol w:w="1539"/>
+        <w:gridCol w:w="1539"/>
       </w:tblGrid>
       <w:tr>
         <w:trPr>
@@ -10069,7 +10090,7 @@
         </w:trPr>
         <w:tc>
           <w:tcPr>
-            <w:tcW w:w="1960" w:type="dxa"/>
+            <w:tcW w:w="1980" w:type="dxa"/>
           </w:tcPr>
           <w:p>
             <w:pPr>
@@ -10082,7 +10103,7 @@
         </w:tc>
         <w:tc>
           <w:tcPr>
-            <w:tcW w:w="3763" w:type="dxa"/>
+            <w:tcW w:w="3247" w:type="dxa"/>
           </w:tcPr>
           <w:p>
             <w:pPr>
@@ -10095,7 +10116,7 @@
         </w:tc>
         <w:tc>
           <w:tcPr>
-            <w:tcW w:w="1333" w:type="dxa"/>
+            <w:tcW w:w="1346" w:type="dxa"/>
           </w:tcPr>
           <w:p>
             <w:pPr>
@@ -10108,7 +10129,7 @@
         </w:tc>
         <w:tc>
           <w:tcPr>
-            <w:tcW w:w="862" w:type="dxa"/>
+            <w:tcW w:w="1346" w:type="dxa"/>
           </w:tcPr>
           <w:p>
             <w:pPr>
@@ -10123,7 +10144,7 @@
       <w:tr>
         <w:tc>
           <w:tcPr>
-            <w:tcW w:w="1960" w:type="dxa"/>
+            <w:tcW w:w="1980" w:type="dxa"/>
           </w:tcPr>
           <w:p>
             <w:pPr>
@@ -10136,7 +10157,7 @@
         </w:tc>
         <w:tc>
           <w:tcPr>
-            <w:tcW w:w="3763" w:type="dxa"/>
+            <w:tcW w:w="3247" w:type="dxa"/>
           </w:tcPr>
           <w:p>
             <w:pPr>
@@ -10149,29 +10170,35 @@
         </w:tc>
         <w:tc>
           <w:tcPr>
-            <w:tcW w:w="1333" w:type="dxa"/>
-          </w:tcPr>
-          <w:p>
-            <w:pPr>
-              <w:pStyle w:val="Compact"/>
-            </w:pPr>
-          </w:p>
-        </w:tc>
-        <w:tc>
-          <w:tcPr>
-            <w:tcW w:w="862" w:type="dxa"/>
-          </w:tcPr>
-          <w:p>
-            <w:pPr>
-              <w:pStyle w:val="Compact"/>
-            </w:pPr>
-          </w:p>
-        </w:tc>
-      </w:tr>
-      <w:tr>
-        <w:tc>
-          <w:tcPr>
-            <w:tcW w:w="1960" w:type="dxa"/>
+            <w:tcW w:w="1346" w:type="dxa"/>
+          </w:tcPr>
+          <w:p>
+            <w:pPr>
+              <w:pStyle w:val="Compact"/>
+            </w:pPr>
+            <w:r>
+              <w:t>Aprobado</w:t>
+            </w:r>
+          </w:p>
+        </w:tc>
+        <w:tc>
+          <w:tcPr>
+            <w:tcW w:w="1346" w:type="dxa"/>
+          </w:tcPr>
+          <w:p>
+            <w:pPr>
+              <w:pStyle w:val="Compact"/>
+            </w:pPr>
+            <w:r>
+              <w:t>23-10-2026</w:t>
+            </w:r>
+          </w:p>
+        </w:tc>
+      </w:tr>
+      <w:tr>
+        <w:tc>
+          <w:tcPr>
+            <w:tcW w:w="1980" w:type="dxa"/>
           </w:tcPr>
           <w:p>
             <w:pPr>
@@ -10184,7 +10211,7 @@
         </w:tc>
         <w:tc>
           <w:tcPr>
-            <w:tcW w:w="3763" w:type="dxa"/>
+            <w:tcW w:w="3247" w:type="dxa"/>
           </w:tcPr>
           <w:p>
             <w:pPr>
@@ -10197,29 +10224,35 @@
         </w:tc>
         <w:tc>
           <w:tcPr>
-            <w:tcW w:w="1333" w:type="dxa"/>
-          </w:tcPr>
-          <w:p>
-            <w:pPr>
-              <w:pStyle w:val="Compact"/>
-            </w:pPr>
-          </w:p>
-        </w:tc>
-        <w:tc>
-          <w:tcPr>
-            <w:tcW w:w="862" w:type="dxa"/>
-          </w:tcPr>
-          <w:p>
-            <w:pPr>
-              <w:pStyle w:val="Compact"/>
-            </w:pPr>
-          </w:p>
-        </w:tc>
-      </w:tr>
-      <w:tr>
-        <w:tc>
-          <w:tcPr>
-            <w:tcW w:w="1960" w:type="dxa"/>
+            <w:tcW w:w="1346" w:type="dxa"/>
+          </w:tcPr>
+          <w:p>
+            <w:pPr>
+              <w:pStyle w:val="Compact"/>
+            </w:pPr>
+            <w:r>
+              <w:t>Aprobado</w:t>
+            </w:r>
+          </w:p>
+        </w:tc>
+        <w:tc>
+          <w:tcPr>
+            <w:tcW w:w="1346" w:type="dxa"/>
+          </w:tcPr>
+          <w:p>
+            <w:pPr>
+              <w:pStyle w:val="Compact"/>
+            </w:pPr>
+            <w:r>
+              <w:t>23-10-2026</w:t>
+            </w:r>
+          </w:p>
+        </w:tc>
+      </w:tr>
+      <w:tr>
+        <w:tc>
+          <w:tcPr>
+            <w:tcW w:w="1980" w:type="dxa"/>
           </w:tcPr>
           <w:p>
             <w:pPr>
@@ -10232,7 +10265,7 @@
         </w:tc>
         <w:tc>
           <w:tcPr>
-            <w:tcW w:w="3763" w:type="dxa"/>
+            <w:tcW w:w="3247" w:type="dxa"/>
           </w:tcPr>
           <w:p>
             <w:pPr>
@@ -10245,42 +10278,49 @@
         </w:tc>
         <w:tc>
           <w:tcPr>
-            <w:tcW w:w="1333" w:type="dxa"/>
-          </w:tcPr>
-          <w:p>
-            <w:pPr>
-              <w:pStyle w:val="Compact"/>
-            </w:pPr>
-          </w:p>
-        </w:tc>
-        <w:tc>
-          <w:tcPr>
-            <w:tcW w:w="862" w:type="dxa"/>
-          </w:tcPr>
-          <w:p>
-            <w:pPr>
-              <w:pStyle w:val="Compact"/>
-            </w:pPr>
-          </w:p>
-        </w:tc>
-      </w:tr>
-      <w:tr>
-        <w:tc>
-          <w:tcPr>
-            <w:tcW w:w="1960" w:type="dxa"/>
-          </w:tcPr>
-          <w:p>
-            <w:pPr>
-              <w:pStyle w:val="Compact"/>
-            </w:pPr>
-            <w:r>
+            <w:tcW w:w="1346" w:type="dxa"/>
+          </w:tcPr>
+          <w:p>
+            <w:pPr>
+              <w:pStyle w:val="Compact"/>
+            </w:pPr>
+            <w:r>
+              <w:t>Aprobado</w:t>
+            </w:r>
+          </w:p>
+        </w:tc>
+        <w:tc>
+          <w:tcPr>
+            <w:tcW w:w="1346" w:type="dxa"/>
+          </w:tcPr>
+          <w:p>
+            <w:pPr>
+              <w:pStyle w:val="Compact"/>
+            </w:pPr>
+            <w:r>
+              <w:t>23-10-2026</w:t>
+            </w:r>
+          </w:p>
+        </w:tc>
+      </w:tr>
+      <w:tr>
+        <w:tc>
+          <w:tcPr>
+            <w:tcW w:w="1980" w:type="dxa"/>
+          </w:tcPr>
+          <w:p>
+            <w:pPr>
+              <w:pStyle w:val="Compact"/>
+            </w:pPr>
+            <w:r>
+              <w:lastRenderedPageBreak/>
               <w:t>Benjamín Cáceres</w:t>
             </w:r>
           </w:p>
         </w:tc>
         <w:tc>
           <w:tcPr>
-            <w:tcW w:w="3763" w:type="dxa"/>
+            <w:tcW w:w="3247" w:type="dxa"/>
           </w:tcPr>
           <w:p>
             <w:pPr>
@@ -10293,28 +10333,41 @@
         </w:tc>
         <w:tc>
           <w:tcPr>
-            <w:tcW w:w="1333" w:type="dxa"/>
-          </w:tcPr>
-          <w:p>
-            <w:pPr>
-              <w:pStyle w:val="Compact"/>
-            </w:pPr>
-          </w:p>
-        </w:tc>
-        <w:tc>
-          <w:tcPr>
-            <w:tcW w:w="862" w:type="dxa"/>
-          </w:tcPr>
-          <w:p>
-            <w:pPr>
-              <w:pStyle w:val="Compact"/>
-            </w:pPr>
-          </w:p>
-        </w:tc>
-      </w:tr>
+            <w:tcW w:w="1346" w:type="dxa"/>
+          </w:tcPr>
+          <w:p>
+            <w:pPr>
+              <w:pStyle w:val="Compact"/>
+            </w:pPr>
+            <w:r>
+              <w:t>Aprobado</w:t>
+            </w:r>
+          </w:p>
+        </w:tc>
+        <w:tc>
+          <w:tcPr>
+            <w:tcW w:w="1346" w:type="dxa"/>
+          </w:tcPr>
+          <w:p>
+            <w:pPr>
+              <w:pStyle w:val="Compact"/>
+            </w:pPr>
+            <w:r>
+              <w:t>23-10-2026</w:t>
+            </w:r>
+          </w:p>
+        </w:tc>
+      </w:tr>
+    </w:tbl>
+    <w:p>
+      <w:pPr>
+        <w:pStyle w:val="Textoindependiente"/>
+      </w:pPr>
+      <w:r>
+        <w:t>Aprobación registrada por Iahn Vera (jefe de proyecto) el 23-10-2026.</w:t>
+      </w:r>
       <w:bookmarkEnd w:id="52"/>
-    </w:tbl>
-    <w:p/>
+    </w:p>
     <w:sectPr>
       <w:footnotePr>
         <w:numRestart w:val="eachSect"/>
@@ -10330,83 +10383,6 @@
 <file path=word/numbering.xml><?xml version="1.0" encoding="utf-8"?>
 <w:numbering xmlns:wpc="http://schemas.microsoft.com/office/word/2010/wordprocessingCanvas" xmlns:cx="http://schemas.microsoft.com/office/drawing/2014/chartex" xmlns:cx1="http://schemas.microsoft.com/office/drawing/2015/9/8/chartex" xmlns:cx2="http://schemas.microsoft.com/office/drawing/2015/10/21/chartex" xmlns:cx3="http://schemas.microsoft.com/office/drawing/2016/5/9/chartex" xmlns:cx4="http://schemas.microsoft.com/office/drawing/2016/5/10/chartex" xmlns:cx5="http://schemas.microsoft.com/office/drawing/2016/5/11/chartex" xmlns:cx6="http://schemas.microsoft.com/office/drawing/2016/5/12/chartex" xmlns:cx7="http://schemas.microsoft.com/office/drawing/2016/5/13/chartex" xmlns:cx8="http://schemas.microsoft.com/office/drawing/2016/5/14/chartex" xmlns:mc="http://schemas.openxmlformats.org/markup-compatibility/2006" xmlns:aink="http://schemas.microsoft.com/office/drawing/2016/ink" xmlns:am3d="http://schemas.microsoft.com/office/drawing/2017/model3d" xmlns:o="urn:schemas-microsoft-com:office:office" xmlns:oel="http://schemas.microsoft.com/office/2019/extlst" xmlns:r="http://schemas.openxmlformats.org/officeDocument/2006/relationships" xmlns:m="http://schemas.openxmlformats.org/officeDocument/2006/math" xmlns:v="urn:schemas-microsoft-com:vml" xmlns:wp14="http://schemas.microsoft.com/office/word/2010/wordprocessingDrawing" xmlns:wp="http://schemas.openxmlformats.org/drawingml/2006/wordprocessingDrawing" xmlns:w10="urn:schemas-microsoft-com:office:word" xmlns:w="http://schemas.openxmlformats.org/wordprocessingml/2006/main" xmlns:w14="http://schemas.microsoft.com/office/word/2010/wordml" xmlns:w15="http://schemas.microsoft.com/office/word/2012/wordml" xmlns:w16cex="http://schemas.microsoft.com/office/word/2018/wordml/cex" xmlns:w16cid="http://schemas.microsoft.com/office/word/2016/wordml/cid" xmlns:w16="http://schemas.microsoft.com/office/word/2018/wordml" xmlns:w16du="http://schemas.microsoft.com/office/word/2023/wordml/word16du" xmlns:w16sdtdh="http://schemas.microsoft.com/office/word/2020/wordml/sdtdatahash" xmlns:w16sdtfl="http://schemas.microsoft.com/office/word/2024/wordml/sdtformatlock" xmlns:w16se="http://schemas.microsoft.com/office/word/2015/wordml/symex" xmlns:wpg="http://schemas.microsoft.com/office/word/2010/wordprocessingGroup" xmlns:wpi="http://schemas.microsoft.com/office/word/2010/wordprocessingInk" xmlns:wne="http://schemas.microsoft.com/office/word/2006/wordml" xmlns:wps="http://schemas.microsoft.com/office/word/2010/wordprocessingShape" mc:Ignorable="w14 w15 w16se w16cid w16 w16cex w16sdtdh w16sdtfl w16du wp14">
   <w:abstractNum w:abstractNumId="0" w15:restartNumberingAfterBreak="0">
-    <w:nsid w:val="0000A990"/>
-    <w:multiLevelType w:val="multilevel"/>
-    <w:tmpl w:val="A9524230"/>
-    <w:lvl w:ilvl="0">
-      <w:numFmt w:val="bullet"/>
-      <w:lvlText w:val=" "/>
-      <w:lvlJc w:val="left"/>
-      <w:pPr>
-        <w:ind w:left="720" w:hanging="360"/>
-      </w:pPr>
-    </w:lvl>
-    <w:lvl w:ilvl="1">
-      <w:numFmt w:val="bullet"/>
-      <w:lvlText w:val=" "/>
-      <w:lvlJc w:val="left"/>
-      <w:pPr>
-        <w:ind w:left="1440" w:hanging="360"/>
-      </w:pPr>
-    </w:lvl>
-    <w:lvl w:ilvl="2">
-      <w:numFmt w:val="bullet"/>
-      <w:lvlText w:val=" "/>
-      <w:lvlJc w:val="left"/>
-      <w:pPr>
-        <w:ind w:left="2160" w:hanging="360"/>
-      </w:pPr>
-    </w:lvl>
-    <w:lvl w:ilvl="3">
-      <w:numFmt w:val="bullet"/>
-      <w:lvlText w:val=" "/>
-      <w:lvlJc w:val="left"/>
-      <w:pPr>
-        <w:ind w:left="2880" w:hanging="360"/>
-      </w:pPr>
-    </w:lvl>
-    <w:lvl w:ilvl="4">
-      <w:numFmt w:val="bullet"/>
-      <w:lvlText w:val=" "/>
-      <w:lvlJc w:val="left"/>
-      <w:pPr>
-        <w:ind w:left="3600" w:hanging="360"/>
-      </w:pPr>
-    </w:lvl>
-    <w:lvl w:ilvl="5">
-      <w:numFmt w:val="bullet"/>
-      <w:lvlText w:val=" "/>
-      <w:lvlJc w:val="left"/>
-      <w:pPr>
-        <w:ind w:left="4320" w:hanging="360"/>
-      </w:pPr>
-    </w:lvl>
-    <w:lvl w:ilvl="6">
-      <w:numFmt w:val="bullet"/>
-      <w:lvlText w:val=" "/>
-      <w:lvlJc w:val="left"/>
-      <w:pPr>
-        <w:ind w:left="5040" w:hanging="360"/>
-      </w:pPr>
-    </w:lvl>
-    <w:lvl w:ilvl="7">
-      <w:numFmt w:val="bullet"/>
-      <w:lvlText w:val=" "/>
-      <w:lvlJc w:val="left"/>
-      <w:pPr>
-        <w:ind w:left="5760" w:hanging="360"/>
-      </w:pPr>
-    </w:lvl>
-    <w:lvl w:ilvl="8">
-      <w:numFmt w:val="bullet"/>
-      <w:lvlText w:val=" "/>
-      <w:lvlJc w:val="left"/>
-      <w:pPr>
-        <w:ind w:left="6480" w:hanging="360"/>
-      </w:pPr>
-    </w:lvl>
-  </w:abstractNum>
-  <w:abstractNum w:abstractNumId="1" w15:restartNumberingAfterBreak="0">
     <w:nsid w:val="0000A991"/>
     <w:multiLevelType w:val="multilevel"/>
     <w:tmpl w:val="DED410BE"/>
@@ -10510,84 +10486,7 @@
       </w:rPr>
     </w:lvl>
   </w:abstractNum>
-  <w:abstractNum w:abstractNumId="2" w15:restartNumberingAfterBreak="0">
-    <w:nsid w:val="0000A992"/>
-    <w:multiLevelType w:val="multilevel"/>
-    <w:tmpl w:val="0102E7C6"/>
-    <w:lvl w:ilvl="0">
-      <w:numFmt w:val="bullet"/>
-      <w:lvlText w:val="☐"/>
-      <w:lvlJc w:val="left"/>
-      <w:pPr>
-        <w:ind w:left="720" w:hanging="360"/>
-      </w:pPr>
-    </w:lvl>
-    <w:lvl w:ilvl="1">
-      <w:numFmt w:val="bullet"/>
-      <w:lvlText w:val="☐"/>
-      <w:lvlJc w:val="left"/>
-      <w:pPr>
-        <w:ind w:left="1440" w:hanging="360"/>
-      </w:pPr>
-    </w:lvl>
-    <w:lvl w:ilvl="2">
-      <w:numFmt w:val="bullet"/>
-      <w:lvlText w:val="☐"/>
-      <w:lvlJc w:val="left"/>
-      <w:pPr>
-        <w:ind w:left="2160" w:hanging="360"/>
-      </w:pPr>
-    </w:lvl>
-    <w:lvl w:ilvl="3">
-      <w:numFmt w:val="bullet"/>
-      <w:lvlText w:val="☐"/>
-      <w:lvlJc w:val="left"/>
-      <w:pPr>
-        <w:ind w:left="2880" w:hanging="360"/>
-      </w:pPr>
-    </w:lvl>
-    <w:lvl w:ilvl="4">
-      <w:numFmt w:val="bullet"/>
-      <w:lvlText w:val="☐"/>
-      <w:lvlJc w:val="left"/>
-      <w:pPr>
-        <w:ind w:left="3600" w:hanging="360"/>
-      </w:pPr>
-    </w:lvl>
-    <w:lvl w:ilvl="5">
-      <w:numFmt w:val="bullet"/>
-      <w:lvlText w:val="☐"/>
-      <w:lvlJc w:val="left"/>
-      <w:pPr>
-        <w:ind w:left="4320" w:hanging="360"/>
-      </w:pPr>
-    </w:lvl>
-    <w:lvl w:ilvl="6">
-      <w:numFmt w:val="bullet"/>
-      <w:lvlText w:val="☐"/>
-      <w:lvlJc w:val="left"/>
-      <w:pPr>
-        <w:ind w:left="5040" w:hanging="360"/>
-      </w:pPr>
-    </w:lvl>
-    <w:lvl w:ilvl="7">
-      <w:numFmt w:val="bullet"/>
-      <w:lvlText w:val="☐"/>
-      <w:lvlJc w:val="left"/>
-      <w:pPr>
-        <w:ind w:left="5760" w:hanging="360"/>
-      </w:pPr>
-    </w:lvl>
-    <w:lvl w:ilvl="8">
-      <w:numFmt w:val="bullet"/>
-      <w:lvlText w:val="☐"/>
-      <w:lvlJc w:val="left"/>
-      <w:pPr>
-        <w:ind w:left="6480" w:hanging="360"/>
-      </w:pPr>
-    </w:lvl>
-  </w:abstractNum>
-  <w:abstractNum w:abstractNumId="3" w15:restartNumberingAfterBreak="0">
+  <w:abstractNum w:abstractNumId="1" w15:restartNumberingAfterBreak="0">
     <w:nsid w:val="0000A993"/>
     <w:multiLevelType w:val="multilevel"/>
     <w:tmpl w:val="CE02D1B6"/>
@@ -10664,7 +10563,7 @@
       </w:pPr>
     </w:lvl>
   </w:abstractNum>
-  <w:abstractNum w:abstractNumId="4" w15:restartNumberingAfterBreak="0">
+  <w:abstractNum w:abstractNumId="2" w15:restartNumberingAfterBreak="0">
     <w:nsid w:val="00A99411"/>
     <w:multiLevelType w:val="multilevel"/>
     <w:tmpl w:val="D3D060BA"/>
@@ -10750,11 +10649,8 @@
       </w:pPr>
     </w:lvl>
   </w:abstractNum>
-  <w:num w:numId="1" w16cid:durableId="220487383">
-    <w:abstractNumId w:val="0"/>
-  </w:num>
-  <w:num w:numId="2" w16cid:durableId="963270717">
-    <w:abstractNumId w:val="4"/>
+  <w:num w:numId="1" w16cid:durableId="2027098281">
+    <w:abstractNumId w:val="2"/>
     <w:lvlOverride w:ilvl="0">
       <w:startOverride w:val="1"/>
     </w:lvlOverride>
@@ -10783,20 +10679,20 @@
       <w:startOverride w:val="1"/>
     </w:lvlOverride>
   </w:num>
-  <w:num w:numId="3" w16cid:durableId="586765518">
-    <w:abstractNumId w:val="1"/>
+  <w:num w:numId="2" w16cid:durableId="928733159">
+    <w:abstractNumId w:val="0"/>
   </w:num>
-  <w:num w:numId="4" w16cid:durableId="1908999640">
-    <w:abstractNumId w:val="1"/>
+  <w:num w:numId="3" w16cid:durableId="2083600078">
+    <w:abstractNumId w:val="0"/>
   </w:num>
-  <w:num w:numId="5" w16cid:durableId="811484709">
-    <w:abstractNumId w:val="1"/>
+  <w:num w:numId="4" w16cid:durableId="823208240">
+    <w:abstractNumId w:val="0"/>
   </w:num>
-  <w:num w:numId="6" w16cid:durableId="1585650894">
-    <w:abstractNumId w:val="1"/>
+  <w:num w:numId="5" w16cid:durableId="1971520603">
+    <w:abstractNumId w:val="0"/>
   </w:num>
-  <w:num w:numId="7" w16cid:durableId="77993167">
-    <w:abstractNumId w:val="4"/>
+  <w:num w:numId="6" w16cid:durableId="1769495943">
+    <w:abstractNumId w:val="2"/>
     <w:lvlOverride w:ilvl="0">
       <w:startOverride w:val="1"/>
     </w:lvlOverride>
@@ -10825,11 +10721,11 @@
       <w:startOverride w:val="1"/>
     </w:lvlOverride>
   </w:num>
-  <w:num w:numId="8" w16cid:durableId="317152044">
-    <w:abstractNumId w:val="1"/>
+  <w:num w:numId="7" w16cid:durableId="960574236">
+    <w:abstractNumId w:val="0"/>
   </w:num>
-  <w:num w:numId="9" w16cid:durableId="1405954406">
-    <w:abstractNumId w:val="4"/>
+  <w:num w:numId="8" w16cid:durableId="417136979">
+    <w:abstractNumId w:val="2"/>
     <w:lvlOverride w:ilvl="0">
       <w:startOverride w:val="1"/>
     </w:lvlOverride>
@@ -10858,11 +10754,11 @@
       <w:startOverride w:val="1"/>
     </w:lvlOverride>
   </w:num>
-  <w:num w:numId="10" w16cid:durableId="1445493206">
-    <w:abstractNumId w:val="1"/>
+  <w:num w:numId="9" w16cid:durableId="1003048259">
+    <w:abstractNumId w:val="0"/>
   </w:num>
-  <w:num w:numId="11" w16cid:durableId="1841117770">
-    <w:abstractNumId w:val="4"/>
+  <w:num w:numId="10" w16cid:durableId="678119061">
+    <w:abstractNumId w:val="2"/>
     <w:lvlOverride w:ilvl="0">
       <w:startOverride w:val="1"/>
     </w:lvlOverride>
@@ -10891,11 +10787,11 @@
       <w:startOverride w:val="1"/>
     </w:lvlOverride>
   </w:num>
-  <w:num w:numId="12" w16cid:durableId="1495685793">
-    <w:abstractNumId w:val="1"/>
+  <w:num w:numId="11" w16cid:durableId="423186772">
+    <w:abstractNumId w:val="0"/>
   </w:num>
-  <w:num w:numId="13" w16cid:durableId="315301269">
-    <w:abstractNumId w:val="4"/>
+  <w:num w:numId="12" w16cid:durableId="519318992">
+    <w:abstractNumId w:val="2"/>
     <w:lvlOverride w:ilvl="0">
       <w:startOverride w:val="1"/>
     </w:lvlOverride>
@@ -10924,213 +10820,25 @@
       <w:startOverride w:val="1"/>
     </w:lvlOverride>
   </w:num>
-  <w:num w:numId="14" w16cid:durableId="133104832">
+  <w:num w:numId="13" w16cid:durableId="504054893">
+    <w:abstractNumId w:val="0"/>
+  </w:num>
+  <w:num w:numId="14" w16cid:durableId="56756350">
     <w:abstractNumId w:val="1"/>
   </w:num>
-  <w:num w:numId="15" w16cid:durableId="1433820983">
-    <w:abstractNumId w:val="2"/>
+  <w:num w:numId="15" w16cid:durableId="1489253143">
+    <w:abstractNumId w:val="1"/>
   </w:num>
-  <w:num w:numId="16" w16cid:durableId="1511678163">
-    <w:abstractNumId w:val="2"/>
+  <w:num w:numId="16" w16cid:durableId="2124766332">
+    <w:abstractNumId w:val="1"/>
   </w:num>
-  <w:num w:numId="17" w16cid:durableId="845243202">
-    <w:abstractNumId w:val="2"/>
+  <w:num w:numId="17" w16cid:durableId="1743673955">
+    <w:abstractNumId w:val="1"/>
   </w:num>
-  <w:num w:numId="18" w16cid:durableId="2072271234">
-    <w:abstractNumId w:val="2"/>
-  </w:num>
-  <w:num w:numId="19" w16cid:durableId="472451964">
+  <w:num w:numId="18" w16cid:durableId="1780493806">
     <w:abstractNumId w:val="0"/>
   </w:num>
-  <w:num w:numId="20" w16cid:durableId="1847402825">
-    <w:abstractNumId w:val="4"/>
-    <w:lvlOverride w:ilvl="0">
-      <w:startOverride w:val="1"/>
-    </w:lvlOverride>
-    <w:lvlOverride w:ilvl="1">
-      <w:startOverride w:val="1"/>
-    </w:lvlOverride>
-    <w:lvlOverride w:ilvl="2">
-      <w:startOverride w:val="1"/>
-    </w:lvlOverride>
-    <w:lvlOverride w:ilvl="3">
-      <w:startOverride w:val="1"/>
-    </w:lvlOverride>
-    <w:lvlOverride w:ilvl="4">
-      <w:startOverride w:val="1"/>
-    </w:lvlOverride>
-    <w:lvlOverride w:ilvl="5">
-      <w:startOverride w:val="1"/>
-    </w:lvlOverride>
-    <w:lvlOverride w:ilvl="6">
-      <w:startOverride w:val="1"/>
-    </w:lvlOverride>
-    <w:lvlOverride w:ilvl="7">
-      <w:startOverride w:val="1"/>
-    </w:lvlOverride>
-    <w:lvlOverride w:ilvl="8">
-      <w:startOverride w:val="1"/>
-    </w:lvlOverride>
-  </w:num>
-  <w:num w:numId="21" w16cid:durableId="460928153">
-    <w:abstractNumId w:val="1"/>
-  </w:num>
-  <w:num w:numId="22" w16cid:durableId="862547643">
-    <w:abstractNumId w:val="1"/>
-  </w:num>
-  <w:num w:numId="23" w16cid:durableId="2055546327">
-    <w:abstractNumId w:val="1"/>
-  </w:num>
-  <w:num w:numId="24" w16cid:durableId="1408381937">
-    <w:abstractNumId w:val="1"/>
-  </w:num>
-  <w:num w:numId="25" w16cid:durableId="1187984776">
-    <w:abstractNumId w:val="4"/>
-    <w:lvlOverride w:ilvl="0">
-      <w:startOverride w:val="1"/>
-    </w:lvlOverride>
-    <w:lvlOverride w:ilvl="1">
-      <w:startOverride w:val="1"/>
-    </w:lvlOverride>
-    <w:lvlOverride w:ilvl="2">
-      <w:startOverride w:val="1"/>
-    </w:lvlOverride>
-    <w:lvlOverride w:ilvl="3">
-      <w:startOverride w:val="1"/>
-    </w:lvlOverride>
-    <w:lvlOverride w:ilvl="4">
-      <w:startOverride w:val="1"/>
-    </w:lvlOverride>
-    <w:lvlOverride w:ilvl="5">
-      <w:startOverride w:val="1"/>
-    </w:lvlOverride>
-    <w:lvlOverride w:ilvl="6">
-      <w:startOverride w:val="1"/>
-    </w:lvlOverride>
-    <w:lvlOverride w:ilvl="7">
-      <w:startOverride w:val="1"/>
-    </w:lvlOverride>
-    <w:lvlOverride w:ilvl="8">
-      <w:startOverride w:val="1"/>
-    </w:lvlOverride>
-  </w:num>
-  <w:num w:numId="26" w16cid:durableId="1342196729">
-    <w:abstractNumId w:val="1"/>
-  </w:num>
-  <w:num w:numId="27" w16cid:durableId="547448612">
-    <w:abstractNumId w:val="4"/>
-    <w:lvlOverride w:ilvl="0">
-      <w:startOverride w:val="1"/>
-    </w:lvlOverride>
-    <w:lvlOverride w:ilvl="1">
-      <w:startOverride w:val="1"/>
-    </w:lvlOverride>
-    <w:lvlOverride w:ilvl="2">
-      <w:startOverride w:val="1"/>
-    </w:lvlOverride>
-    <w:lvlOverride w:ilvl="3">
-      <w:startOverride w:val="1"/>
-    </w:lvlOverride>
-    <w:lvlOverride w:ilvl="4">
-      <w:startOverride w:val="1"/>
-    </w:lvlOverride>
-    <w:lvlOverride w:ilvl="5">
-      <w:startOverride w:val="1"/>
-    </w:lvlOverride>
-    <w:lvlOverride w:ilvl="6">
-      <w:startOverride w:val="1"/>
-    </w:lvlOverride>
-    <w:lvlOverride w:ilvl="7">
-      <w:startOverride w:val="1"/>
-    </w:lvlOverride>
-    <w:lvlOverride w:ilvl="8">
-      <w:startOverride w:val="1"/>
-    </w:lvlOverride>
-  </w:num>
-  <w:num w:numId="28" w16cid:durableId="224872873">
-    <w:abstractNumId w:val="1"/>
-  </w:num>
-  <w:num w:numId="29" w16cid:durableId="451246067">
-    <w:abstractNumId w:val="4"/>
-    <w:lvlOverride w:ilvl="0">
-      <w:startOverride w:val="1"/>
-    </w:lvlOverride>
-    <w:lvlOverride w:ilvl="1">
-      <w:startOverride w:val="1"/>
-    </w:lvlOverride>
-    <w:lvlOverride w:ilvl="2">
-      <w:startOverride w:val="1"/>
-    </w:lvlOverride>
-    <w:lvlOverride w:ilvl="3">
-      <w:startOverride w:val="1"/>
-    </w:lvlOverride>
-    <w:lvlOverride w:ilvl="4">
-      <w:startOverride w:val="1"/>
-    </w:lvlOverride>
-    <w:lvlOverride w:ilvl="5">
-      <w:startOverride w:val="1"/>
-    </w:lvlOverride>
-    <w:lvlOverride w:ilvl="6">
-      <w:startOverride w:val="1"/>
-    </w:lvlOverride>
-    <w:lvlOverride w:ilvl="7">
-      <w:startOverride w:val="1"/>
-    </w:lvlOverride>
-    <w:lvlOverride w:ilvl="8">
-      <w:startOverride w:val="1"/>
-    </w:lvlOverride>
-  </w:num>
-  <w:num w:numId="30" w16cid:durableId="1288194900">
-    <w:abstractNumId w:val="1"/>
-  </w:num>
-  <w:num w:numId="31" w16cid:durableId="124005111">
-    <w:abstractNumId w:val="4"/>
-    <w:lvlOverride w:ilvl="0">
-      <w:startOverride w:val="1"/>
-    </w:lvlOverride>
-    <w:lvlOverride w:ilvl="1">
-      <w:startOverride w:val="1"/>
-    </w:lvlOverride>
-    <w:lvlOverride w:ilvl="2">
-      <w:startOverride w:val="1"/>
-    </w:lvlOverride>
-    <w:lvlOverride w:ilvl="3">
-      <w:startOverride w:val="1"/>
-    </w:lvlOverride>
-    <w:lvlOverride w:ilvl="4">
-      <w:startOverride w:val="1"/>
-    </w:lvlOverride>
-    <w:lvlOverride w:ilvl="5">
-      <w:startOverride w:val="1"/>
-    </w:lvlOverride>
-    <w:lvlOverride w:ilvl="6">
-      <w:startOverride w:val="1"/>
-    </w:lvlOverride>
-    <w:lvlOverride w:ilvl="7">
-      <w:startOverride w:val="1"/>
-    </w:lvlOverride>
-    <w:lvlOverride w:ilvl="8">
-      <w:startOverride w:val="1"/>
-    </w:lvlOverride>
-  </w:num>
-  <w:num w:numId="32" w16cid:durableId="1913461862">
-    <w:abstractNumId w:val="1"/>
-  </w:num>
-  <w:num w:numId="33" w16cid:durableId="448932379">
-    <w:abstractNumId w:val="2"/>
-  </w:num>
-  <w:num w:numId="34" w16cid:durableId="1700353909">
-    <w:abstractNumId w:val="3"/>
-  </w:num>
-  <w:num w:numId="35" w16cid:durableId="150144726">
-    <w:abstractNumId w:val="3"/>
-  </w:num>
-  <w:num w:numId="36" w16cid:durableId="390276247">
-    <w:abstractNumId w:val="3"/>
-  </w:num>
-  <w:num w:numId="37" w16cid:durableId="2121683199">
-    <w:abstractNumId w:val="1"/>
-  </w:num>
+  <w:numIdMacAtCleanup w:val="18"/>
 </w:numbering>
 </file>
 

</xml_diff>